<commit_message>
Atualização do README, novas anotações da aula 17 e a criação dos arquivos referêntes a aula 17 (de 78 à 83).
</commit_message>
<xml_diff>
--- a/Mundo 3/Python Mundo 3 - Gustavo Guanabara.docx
+++ b/Mundo 3/Python Mundo 3 - Gustavo Guanabara.docx
@@ -209,12 +209,12 @@
           <wp:inline distB="114300" distT="114300" distL="114300" distR="114300">
             <wp:extent cx="4923410" cy="2567422"/>
             <wp:effectExtent b="0" l="0" r="0" t="0"/>
-            <wp:docPr id="1" name="image1.png"/>
+            <wp:docPr id="2" name="image3.png"/>
             <a:graphic>
               <a:graphicData uri="http://schemas.openxmlformats.org/drawingml/2006/picture">
                 <pic:pic>
                   <pic:nvPicPr>
-                    <pic:cNvPr id="0" name="image1.png"/>
+                    <pic:cNvPr id="0" name="image3.png"/>
                     <pic:cNvPicPr preferRelativeResize="0"/>
                   </pic:nvPicPr>
                   <pic:blipFill>
@@ -1190,10 +1190,1025 @@
         </w:rPr>
         <w:t xml:space="preserve">{ } - Dicionários</w:t>
       </w:r>
-      <w:r>
-        <w:rPr>
-          <w:rtl w:val="0"/>
-        </w:rPr>
+    </w:p>
+    <w:p>
+      <w:pPr>
+        <w:pStyle w:val="Heading1"/>
+        <w:jc w:val="left"/>
+        <w:rPr/>
+      </w:pPr>
+      <w:bookmarkStart w:colFirst="0" w:colLast="0" w:name="_frpcqlnb3d0l" w:id="25"/>
+      <w:bookmarkEnd w:id="25"/>
+      <w:r>
+        <w:rPr>
+          <w:rtl w:val="0"/>
+        </w:rPr>
+        <w:t xml:space="preserve">Aula 17  - Variáveis compostas - Listas (Parte 01):</w:t>
+      </w:r>
+    </w:p>
+    <w:p>
+      <w:pPr>
+        <w:pStyle w:val="Heading2"/>
+        <w:rPr/>
+      </w:pPr>
+      <w:bookmarkStart w:colFirst="0" w:colLast="0" w:name="_bfw37fkfsdnx" w:id="26"/>
+      <w:bookmarkEnd w:id="26"/>
+      <w:r>
+        <w:rPr>
+          <w:rtl w:val="0"/>
+        </w:rPr>
+        <w:t xml:space="preserve">O que é uma lista?</w:t>
+      </w:r>
+    </w:p>
+    <w:p>
+      <w:pPr>
+        <w:rPr/>
+      </w:pPr>
+      <w:r>
+        <w:rPr>
+          <w:rtl w:val="0"/>
+        </w:rPr>
+        <w:t xml:space="preserve">Uma lista é uma estrutura muito parecida com uma tupla, mas diferente delas, as listas são mutáveis.</w:t>
+      </w:r>
+    </w:p>
+    <w:p>
+      <w:pPr>
+        <w:jc w:val="center"/>
+        <w:rPr/>
+      </w:pPr>
+      <w:r>
+        <w:rPr/>
+        <w:drawing>
+          <wp:inline distB="114300" distT="114300" distL="114300" distR="114300">
+            <wp:extent cx="5731200" cy="571500"/>
+            <wp:effectExtent b="0" l="0" r="0" t="0"/>
+            <wp:docPr id="5" name="image1.png"/>
+            <a:graphic>
+              <a:graphicData uri="http://schemas.openxmlformats.org/drawingml/2006/picture">
+                <pic:pic>
+                  <pic:nvPicPr>
+                    <pic:cNvPr id="0" name="image1.png"/>
+                    <pic:cNvPicPr preferRelativeResize="0"/>
+                  </pic:nvPicPr>
+                  <pic:blipFill>
+                    <a:blip r:embed="rId7"/>
+                    <a:srcRect b="0" l="0" r="0" t="0"/>
+                    <a:stretch>
+                      <a:fillRect/>
+                    </a:stretch>
+                  </pic:blipFill>
+                  <pic:spPr>
+                    <a:xfrm>
+                      <a:off x="0" y="0"/>
+                      <a:ext cx="5731200" cy="571500"/>
+                    </a:xfrm>
+                    <a:prstGeom prst="rect"/>
+                    <a:ln/>
+                  </pic:spPr>
+                </pic:pic>
+              </a:graphicData>
+            </a:graphic>
+          </wp:inline>
+        </w:drawing>
+      </w:r>
+      <w:r>
+        <w:rPr>
+          <w:rtl w:val="0"/>
+        </w:rPr>
+      </w:r>
+    </w:p>
+    <w:p>
+      <w:pPr>
+        <w:pStyle w:val="Heading2"/>
+        <w:jc w:val="left"/>
+        <w:rPr/>
+      </w:pPr>
+      <w:bookmarkStart w:colFirst="0" w:colLast="0" w:name="_s0va5p1i0nmw" w:id="27"/>
+      <w:bookmarkEnd w:id="27"/>
+      <w:r>
+        <w:rPr>
+          <w:rtl w:val="0"/>
+        </w:rPr>
+        <w:t xml:space="preserve">Manipulando listas</w:t>
+      </w:r>
+    </w:p>
+    <w:p>
+      <w:pPr>
+        <w:jc w:val="left"/>
+        <w:rPr/>
+      </w:pPr>
+      <w:r>
+        <w:rPr>
+          <w:rtl w:val="0"/>
+        </w:rPr>
+        <w:t xml:space="preserve">Para </w:t>
+      </w:r>
+      <w:r>
+        <w:rPr>
+          <w:b w:val="1"/>
+          <w:bCs w:val="1"/>
+          <w:rtl w:val="0"/>
+        </w:rPr>
+        <w:t xml:space="preserve">criar</w:t>
+      </w:r>
+      <w:r>
+        <w:rPr>
+          <w:rtl w:val="0"/>
+        </w:rPr>
+        <w:t xml:space="preserve"> uma lista dentro do código podemos usar a função </w:t>
+      </w:r>
+      <w:r>
+        <w:rPr>
+          <w:i w:val="1"/>
+          <w:iCs w:val="1"/>
+          <w:rtl w:val="0"/>
+        </w:rPr>
+        <w:t xml:space="preserve">list</w:t>
+      </w:r>
+      <w:r>
+        <w:rPr>
+          <w:rtl w:val="0"/>
+        </w:rPr>
+        <w:t xml:space="preserve"> e combiná-la com </w:t>
+      </w:r>
+      <w:r>
+        <w:rPr>
+          <w:i w:val="1"/>
+          <w:iCs w:val="1"/>
+          <w:rtl w:val="0"/>
+        </w:rPr>
+        <w:t xml:space="preserve">range</w:t>
+      </w:r>
+      <w:r>
+        <w:rPr>
+          <w:rtl w:val="0"/>
+        </w:rPr>
+        <w:t xml:space="preserve">, por exemplo.</w:t>
+      </w:r>
+    </w:p>
+    <w:p>
+      <w:pPr>
+        <w:jc w:val="left"/>
+        <w:rPr/>
+      </w:pPr>
+      <w:r>
+        <w:rPr>
+          <w:rtl w:val="0"/>
+        </w:rPr>
+        <w:t xml:space="preserve">Para </w:t>
+      </w:r>
+      <w:r>
+        <w:rPr>
+          <w:b w:val="1"/>
+          <w:bCs w:val="1"/>
+          <w:rtl w:val="0"/>
+        </w:rPr>
+        <w:t xml:space="preserve">adicionar </w:t>
+      </w:r>
+      <w:r>
+        <w:rPr>
+          <w:rtl w:val="0"/>
+        </w:rPr>
+        <w:t xml:space="preserve">mais valores a uma lista usamos o método </w:t>
+      </w:r>
+      <w:r>
+        <w:rPr>
+          <w:i w:val="1"/>
+          <w:iCs w:val="1"/>
+          <w:rtl w:val="0"/>
+        </w:rPr>
+        <w:t xml:space="preserve">append </w:t>
+      </w:r>
+      <w:r>
+        <w:rPr>
+          <w:rtl w:val="0"/>
+        </w:rPr>
+        <w:t xml:space="preserve">ou o método </w:t>
+      </w:r>
+      <w:r>
+        <w:rPr>
+          <w:i w:val="1"/>
+          <w:iCs w:val="1"/>
+          <w:rtl w:val="0"/>
+        </w:rPr>
+        <w:t xml:space="preserve">insert </w:t>
+      </w:r>
+      <w:r>
+        <w:rPr>
+          <w:rtl w:val="0"/>
+        </w:rPr>
+        <w:t xml:space="preserve">e para </w:t>
+      </w:r>
+      <w:r>
+        <w:rPr>
+          <w:b w:val="1"/>
+          <w:bCs w:val="1"/>
+          <w:rtl w:val="0"/>
+        </w:rPr>
+        <w:t xml:space="preserve">excluir </w:t>
+      </w:r>
+      <w:r>
+        <w:rPr>
+          <w:rtl w:val="0"/>
+        </w:rPr>
+        <w:t xml:space="preserve">valores usamos o comando </w:t>
+      </w:r>
+      <w:r>
+        <w:rPr>
+          <w:i w:val="1"/>
+          <w:iCs w:val="1"/>
+          <w:rtl w:val="0"/>
+        </w:rPr>
+        <w:t xml:space="preserve">del</w:t>
+      </w:r>
+      <w:r>
+        <w:rPr>
+          <w:rtl w:val="0"/>
+        </w:rPr>
+        <w:t xml:space="preserve">, o método </w:t>
+      </w:r>
+      <w:r>
+        <w:rPr>
+          <w:i w:val="1"/>
+          <w:iCs w:val="1"/>
+          <w:rtl w:val="0"/>
+        </w:rPr>
+        <w:t xml:space="preserve">remove </w:t>
+      </w:r>
+      <w:r>
+        <w:rPr>
+          <w:rtl w:val="0"/>
+        </w:rPr>
+        <w:t xml:space="preserve">que remove um ítem baseado no seu valor, ou o método </w:t>
+      </w:r>
+      <w:r>
+        <w:rPr>
+          <w:i w:val="1"/>
+          <w:iCs w:val="1"/>
+          <w:rtl w:val="0"/>
+        </w:rPr>
+        <w:t xml:space="preserve">pop</w:t>
+      </w:r>
+      <w:r>
+        <w:rPr>
+          <w:rtl w:val="0"/>
+        </w:rPr>
+        <w:t xml:space="preserve">.</w:t>
+      </w:r>
+    </w:p>
+    <w:p>
+      <w:pPr>
+        <w:jc w:val="left"/>
+        <w:rPr/>
+      </w:pPr>
+      <w:r>
+        <w:rPr>
+          <w:rtl w:val="0"/>
+        </w:rPr>
+        <w:t xml:space="preserve">Para remover um ítem </w:t>
+      </w:r>
+      <w:r>
+        <w:rPr>
+          <w:b w:val="1"/>
+          <w:bCs w:val="1"/>
+          <w:rtl w:val="0"/>
+        </w:rPr>
+        <w:t xml:space="preserve">com segurança</w:t>
+      </w:r>
+      <w:r>
+        <w:rPr>
+          <w:rtl w:val="0"/>
+        </w:rPr>
+        <w:t xml:space="preserve"> usando o método </w:t>
+      </w:r>
+      <w:r>
+        <w:rPr>
+          <w:i w:val="1"/>
+          <w:iCs w:val="1"/>
+          <w:rtl w:val="0"/>
+        </w:rPr>
+        <w:t xml:space="preserve">remove </w:t>
+      </w:r>
+      <w:r>
+        <w:rPr>
+          <w:rtl w:val="0"/>
+        </w:rPr>
+        <w:t xml:space="preserve">podemos usar a estrutura </w:t>
+      </w:r>
+      <w:r>
+        <w:rPr>
+          <w:i w:val="1"/>
+          <w:iCs w:val="1"/>
+          <w:rtl w:val="0"/>
+        </w:rPr>
+        <w:t xml:space="preserve">if</w:t>
+      </w:r>
+      <w:r>
+        <w:rPr>
+          <w:rtl w:val="0"/>
+        </w:rPr>
+        <w:t xml:space="preserve"> junto com o operador </w:t>
+      </w:r>
+      <w:r>
+        <w:rPr>
+          <w:i w:val="1"/>
+          <w:iCs w:val="1"/>
+          <w:rtl w:val="0"/>
+        </w:rPr>
+        <w:t xml:space="preserve">in</w:t>
+      </w:r>
+      <w:r>
+        <w:rPr>
+          <w:rtl w:val="0"/>
+        </w:rPr>
+        <w:t xml:space="preserve"> para verificar se o ítem em questão está na lista.</w:t>
+      </w:r>
+    </w:p>
+    <w:p>
+      <w:pPr>
+        <w:pStyle w:val="Heading3"/>
+        <w:jc w:val="left"/>
+        <w:rPr/>
+      </w:pPr>
+      <w:bookmarkStart w:colFirst="0" w:colLast="0" w:name="_3jpzqz8qys6o" w:id="28"/>
+      <w:bookmarkEnd w:id="28"/>
+      <w:r>
+        <w:rPr>
+          <w:rtl w:val="0"/>
+        </w:rPr>
+        <w:t xml:space="preserve">Exemplos</w:t>
+      </w:r>
+    </w:p>
+    <w:p>
+      <w:pPr>
+        <w:pStyle w:val="Heading4"/>
+        <w:rPr/>
+      </w:pPr>
+      <w:bookmarkStart w:colFirst="0" w:colLast="0" w:name="_euko5xr6867t" w:id="29"/>
+      <w:bookmarkEnd w:id="29"/>
+      <w:r>
+        <w:rPr>
+          <w:rtl w:val="0"/>
+        </w:rPr>
+        <w:t xml:space="preserve">Criar</w:t>
+      </w:r>
+    </w:p>
+    <w:p>
+      <w:pPr>
+        <w:rPr/>
+      </w:pPr>
+      <w:r>
+        <w:rPr>
+          <w:rtl w:val="0"/>
+        </w:rPr>
+        <w:t xml:space="preserve">valores = list(range(4,11))</w:t>
+      </w:r>
+    </w:p>
+    <w:p>
+      <w:pPr>
+        <w:jc w:val="center"/>
+        <w:rPr/>
+      </w:pPr>
+      <w:r>
+        <w:rPr/>
+        <w:drawing>
+          <wp:inline distB="114300" distT="114300" distL="114300" distR="114300">
+            <wp:extent cx="2887500" cy="882034"/>
+            <wp:effectExtent b="0" l="0" r="0" t="0"/>
+            <wp:docPr id="3" name="image5.png"/>
+            <a:graphic>
+              <a:graphicData uri="http://schemas.openxmlformats.org/drawingml/2006/picture">
+                <pic:pic>
+                  <pic:nvPicPr>
+                    <pic:cNvPr id="0" name="image5.png"/>
+                    <pic:cNvPicPr preferRelativeResize="0"/>
+                  </pic:nvPicPr>
+                  <pic:blipFill>
+                    <a:blip r:embed="rId8"/>
+                    <a:srcRect b="0" l="0" r="0" t="0"/>
+                    <a:stretch>
+                      <a:fillRect/>
+                    </a:stretch>
+                  </pic:blipFill>
+                  <pic:spPr>
+                    <a:xfrm>
+                      <a:off x="0" y="0"/>
+                      <a:ext cx="2887500" cy="882034"/>
+                    </a:xfrm>
+                    <a:prstGeom prst="rect"/>
+                    <a:ln/>
+                  </pic:spPr>
+                </pic:pic>
+              </a:graphicData>
+            </a:graphic>
+          </wp:inline>
+        </w:drawing>
+      </w:r>
+      <w:r>
+        <w:rPr>
+          <w:rtl w:val="0"/>
+        </w:rPr>
+      </w:r>
+    </w:p>
+    <w:p>
+      <w:pPr>
+        <w:pStyle w:val="Heading4"/>
+        <w:rPr/>
+      </w:pPr>
+      <w:bookmarkStart w:colFirst="0" w:colLast="0" w:name="_vuza8yz0b9f2" w:id="30"/>
+      <w:bookmarkEnd w:id="30"/>
+      <w:r>
+        <w:rPr>
+          <w:rtl w:val="0"/>
+        </w:rPr>
+        <w:t xml:space="preserve">Inserir</w:t>
+      </w:r>
+    </w:p>
+    <w:p>
+      <w:pPr>
+        <w:jc w:val="left"/>
+        <w:rPr/>
+      </w:pPr>
+      <w:r>
+        <w:rPr>
+          <w:b w:val="1"/>
+          <w:bCs w:val="1"/>
+          <w:rtl w:val="0"/>
+        </w:rPr>
+        <w:t xml:space="preserve">lanche.append(‘Cookie’)</w:t>
+      </w:r>
+      <w:r>
+        <w:rPr>
+          <w:rFonts w:ascii="Cardo" w:cs="Cardo" w:eastAsia="Cardo" w:hAnsi="Cardo"/>
+          <w:rtl w:val="0"/>
+        </w:rPr>
+        <w:t xml:space="preserve"> → Adiciona um 5º valor ao final da lista.</w:t>
+      </w:r>
+    </w:p>
+    <w:p>
+      <w:pPr>
+        <w:jc w:val="left"/>
+        <w:rPr/>
+      </w:pPr>
+      <w:r>
+        <w:rPr>
+          <w:b w:val="1"/>
+          <w:bCs w:val="1"/>
+          <w:rtl w:val="0"/>
+        </w:rPr>
+        <w:t xml:space="preserve">lanche.insert(0,‘Cachorro Quente’)</w:t>
+      </w:r>
+      <w:r>
+        <w:rPr>
+          <w:rFonts w:ascii="Cardo" w:cs="Cardo" w:eastAsia="Cardo" w:hAnsi="Cardo"/>
+          <w:rtl w:val="0"/>
+        </w:rPr>
+        <w:t xml:space="preserve"> → Adiciona um 5º valor na chave zero “empurrando” a numeração das chaves posteriores para frente.</w:t>
+      </w:r>
+    </w:p>
+    <w:p>
+      <w:pPr>
+        <w:jc w:val="center"/>
+        <w:rPr/>
+      </w:pPr>
+      <w:r>
+        <w:rPr/>
+        <w:drawing>
+          <wp:inline distB="114300" distT="114300" distL="114300" distR="114300">
+            <wp:extent cx="3620925" cy="1322504"/>
+            <wp:effectExtent b="0" l="0" r="0" t="0"/>
+            <wp:docPr id="6" name="image2.png"/>
+            <a:graphic>
+              <a:graphicData uri="http://schemas.openxmlformats.org/drawingml/2006/picture">
+                <pic:pic>
+                  <pic:nvPicPr>
+                    <pic:cNvPr id="0" name="image2.png"/>
+                    <pic:cNvPicPr preferRelativeResize="0"/>
+                  </pic:nvPicPr>
+                  <pic:blipFill>
+                    <a:blip r:embed="rId9"/>
+                    <a:srcRect b="0" l="0" r="0" t="0"/>
+                    <a:stretch>
+                      <a:fillRect/>
+                    </a:stretch>
+                  </pic:blipFill>
+                  <pic:spPr>
+                    <a:xfrm>
+                      <a:off x="0" y="0"/>
+                      <a:ext cx="3620925" cy="1322504"/>
+                    </a:xfrm>
+                    <a:prstGeom prst="rect"/>
+                    <a:ln/>
+                  </pic:spPr>
+                </pic:pic>
+              </a:graphicData>
+            </a:graphic>
+          </wp:inline>
+        </w:drawing>
+      </w:r>
+      <w:r>
+        <w:rPr>
+          <w:rtl w:val="0"/>
+        </w:rPr>
+      </w:r>
+    </w:p>
+    <w:p>
+      <w:pPr>
+        <w:pStyle w:val="Heading4"/>
+        <w:jc w:val="left"/>
+        <w:rPr/>
+      </w:pPr>
+      <w:bookmarkStart w:colFirst="0" w:colLast="0" w:name="_3hbxl56ec778" w:id="31"/>
+      <w:bookmarkEnd w:id="31"/>
+      <w:r>
+        <w:rPr>
+          <w:rtl w:val="0"/>
+        </w:rPr>
+        <w:t xml:space="preserve">Remover</w:t>
+      </w:r>
+    </w:p>
+    <w:p>
+      <w:pPr>
+        <w:jc w:val="left"/>
+        <w:rPr/>
+      </w:pPr>
+      <w:r>
+        <w:rPr>
+          <w:b w:val="1"/>
+          <w:bCs w:val="1"/>
+          <w:rtl w:val="0"/>
+        </w:rPr>
+        <w:t xml:space="preserve">del lanche[3]</w:t>
+      </w:r>
+      <w:r>
+        <w:rPr>
+          <w:rFonts w:ascii="Cardo" w:cs="Cardo" w:eastAsia="Cardo" w:hAnsi="Cardo"/>
+          <w:rtl w:val="0"/>
+        </w:rPr>
+        <w:t xml:space="preserve"> → É um comando, não um método.</w:t>
+      </w:r>
+    </w:p>
+    <w:p>
+      <w:pPr>
+        <w:jc w:val="left"/>
+        <w:rPr/>
+      </w:pPr>
+      <w:r>
+        <w:rPr>
+          <w:b w:val="1"/>
+          <w:bCs w:val="1"/>
+          <w:rtl w:val="0"/>
+        </w:rPr>
+        <w:t xml:space="preserve">lanche.pop(3)</w:t>
+      </w:r>
+      <w:r>
+        <w:rPr>
+          <w:rFonts w:ascii="Cardo" w:cs="Cardo" w:eastAsia="Cardo" w:hAnsi="Cardo"/>
+          <w:rtl w:val="0"/>
+        </w:rPr>
+        <w:t xml:space="preserve"> → Geralmente usado para apagar o último valor, mas pode ser usado indicando o índice.</w:t>
+      </w:r>
+    </w:p>
+    <w:p>
+      <w:pPr>
+        <w:jc w:val="left"/>
+        <w:rPr/>
+      </w:pPr>
+      <w:r>
+        <w:rPr>
+          <w:b w:val="1"/>
+          <w:bCs w:val="1"/>
+          <w:rtl w:val="0"/>
+        </w:rPr>
+        <w:t xml:space="preserve">lanche.remove(‘Pizza’)</w:t>
+      </w:r>
+      <w:r>
+        <w:rPr>
+          <w:rFonts w:ascii="Cardo" w:cs="Cardo" w:eastAsia="Cardo" w:hAnsi="Cardo"/>
+          <w:rtl w:val="0"/>
+        </w:rPr>
+        <w:t xml:space="preserve"> → Esse método remove o valor baseado no seu conteúdo e não no seu índice.</w:t>
+      </w:r>
+    </w:p>
+    <w:p>
+      <w:pPr>
+        <w:jc w:val="center"/>
+        <w:rPr/>
+      </w:pPr>
+      <w:r>
+        <w:rPr/>
+        <w:drawing>
+          <wp:inline distB="114300" distT="114300" distL="114300" distR="114300">
+            <wp:extent cx="3559013" cy="1518636"/>
+            <wp:effectExtent b="0" l="0" r="0" t="0"/>
+            <wp:docPr id="1" name="image6.png"/>
+            <a:graphic>
+              <a:graphicData uri="http://schemas.openxmlformats.org/drawingml/2006/picture">
+                <pic:pic>
+                  <pic:nvPicPr>
+                    <pic:cNvPr id="0" name="image6.png"/>
+                    <pic:cNvPicPr preferRelativeResize="0"/>
+                  </pic:nvPicPr>
+                  <pic:blipFill>
+                    <a:blip r:embed="rId10"/>
+                    <a:srcRect b="0" l="0" r="0" t="0"/>
+                    <a:stretch>
+                      <a:fillRect/>
+                    </a:stretch>
+                  </pic:blipFill>
+                  <pic:spPr>
+                    <a:xfrm>
+                      <a:off x="0" y="0"/>
+                      <a:ext cx="3559013" cy="1518636"/>
+                    </a:xfrm>
+                    <a:prstGeom prst="rect"/>
+                    <a:ln/>
+                  </pic:spPr>
+                </pic:pic>
+              </a:graphicData>
+            </a:graphic>
+          </wp:inline>
+        </w:drawing>
+      </w:r>
+      <w:r>
+        <w:rPr>
+          <w:rtl w:val="0"/>
+        </w:rPr>
+      </w:r>
+    </w:p>
+    <w:p>
+      <w:pPr>
+        <w:jc w:val="left"/>
+        <w:rPr/>
+      </w:pPr>
+      <w:r>
+        <w:rPr>
+          <w:b w:val="1"/>
+          <w:bCs w:val="1"/>
+          <w:rtl w:val="0"/>
+        </w:rPr>
+        <w:t xml:space="preserve">lanche.pop()</w:t>
+      </w:r>
+      <w:r>
+        <w:rPr>
+          <w:rFonts w:ascii="Cardo" w:cs="Cardo" w:eastAsia="Cardo" w:hAnsi="Cardo"/>
+          <w:rtl w:val="0"/>
+        </w:rPr>
+        <w:t xml:space="preserve"> → Remove o último ítem da lista.</w:t>
+      </w:r>
+    </w:p>
+    <w:p>
+      <w:pPr>
+        <w:jc w:val="center"/>
+        <w:rPr/>
+      </w:pPr>
+      <w:r>
+        <w:rPr/>
+        <w:drawing>
+          <wp:inline distB="114300" distT="114300" distL="114300" distR="114300">
+            <wp:extent cx="3282788" cy="1763326"/>
+            <wp:effectExtent b="0" l="0" r="0" t="0"/>
+            <wp:docPr id="4" name="image4.png"/>
+            <a:graphic>
+              <a:graphicData uri="http://schemas.openxmlformats.org/drawingml/2006/picture">
+                <pic:pic>
+                  <pic:nvPicPr>
+                    <pic:cNvPr id="0" name="image4.png"/>
+                    <pic:cNvPicPr preferRelativeResize="0"/>
+                  </pic:nvPicPr>
+                  <pic:blipFill>
+                    <a:blip r:embed="rId11"/>
+                    <a:srcRect b="0" l="0" r="0" t="0"/>
+                    <a:stretch>
+                      <a:fillRect/>
+                    </a:stretch>
+                  </pic:blipFill>
+                  <pic:spPr>
+                    <a:xfrm>
+                      <a:off x="0" y="0"/>
+                      <a:ext cx="3282788" cy="1763326"/>
+                    </a:xfrm>
+                    <a:prstGeom prst="rect"/>
+                    <a:ln/>
+                  </pic:spPr>
+                </pic:pic>
+              </a:graphicData>
+            </a:graphic>
+          </wp:inline>
+        </w:drawing>
+      </w:r>
+      <w:r>
+        <w:rPr>
+          <w:rtl w:val="0"/>
+        </w:rPr>
+      </w:r>
+    </w:p>
+    <w:p>
+      <w:pPr>
+        <w:jc w:val="left"/>
+        <w:rPr>
+          <w:b w:val="1"/>
+          <w:bCs w:val="1"/>
+        </w:rPr>
+      </w:pPr>
+      <w:r>
+        <w:rPr>
+          <w:b w:val="1"/>
+          <w:bCs w:val="1"/>
+          <w:rtl w:val="0"/>
+        </w:rPr>
+        <w:t xml:space="preserve">if ‘Pizza’ in lanche:</w:t>
+      </w:r>
+    </w:p>
+    <w:p>
+      <w:pPr>
+        <w:jc w:val="left"/>
+        <w:rPr/>
+      </w:pPr>
+      <w:r>
+        <w:rPr>
+          <w:rtl w:val="0"/>
+        </w:rPr>
+        <w:tab/>
+        <w:t xml:space="preserve">lanche.remove(‘Pizza’)</w:t>
+      </w:r>
+    </w:p>
+    <w:p>
+      <w:pPr>
+        <w:pStyle w:val="Heading2"/>
+        <w:jc w:val="left"/>
+        <w:rPr/>
+      </w:pPr>
+      <w:bookmarkStart w:colFirst="0" w:colLast="0" w:name="_o8t1a6w0w5hj" w:id="32"/>
+      <w:bookmarkEnd w:id="32"/>
+      <w:r>
+        <w:rPr>
+          <w:rtl w:val="0"/>
+        </w:rPr>
+        <w:t xml:space="preserve">Cópias de listas</w:t>
+      </w:r>
+    </w:p>
+    <w:p>
+      <w:pPr>
+        <w:jc w:val="left"/>
+        <w:rPr/>
+      </w:pPr>
+      <w:r>
+        <w:rPr>
+          <w:rtl w:val="0"/>
+        </w:rPr>
+        <w:t xml:space="preserve">Ao fazer uma lista B receber os valores de outra lista A da forma convencional o Python cria uma ligação entre as duas listas, ou seja, alterando os valores de B, os valores de A são alterados também.</w:t>
+      </w:r>
+    </w:p>
+    <w:p>
+      <w:pPr>
+        <w:jc w:val="left"/>
+        <w:rPr/>
+      </w:pPr>
+      <w:r>
+        <w:rPr>
+          <w:rtl w:val="0"/>
+        </w:rPr>
+        <w:t xml:space="preserve">Para criar uma cópia dos valores de A em B, deve-se fazer com que B receba os valores de A.</w:t>
+      </w:r>
+    </w:p>
+    <w:p>
+      <w:pPr>
+        <w:pStyle w:val="Heading3"/>
+        <w:jc w:val="left"/>
+        <w:rPr/>
+      </w:pPr>
+      <w:bookmarkStart w:colFirst="0" w:colLast="0" w:name="_1qqib0yvl1f7" w:id="33"/>
+      <w:bookmarkEnd w:id="33"/>
+      <w:r>
+        <w:rPr>
+          <w:rtl w:val="0"/>
+        </w:rPr>
+        <w:t xml:space="preserve">Criando uma ligação</w:t>
+      </w:r>
+    </w:p>
+    <w:p>
+      <w:pPr>
+        <w:pStyle w:val="Heading4"/>
+        <w:rPr/>
+      </w:pPr>
+      <w:bookmarkStart w:colFirst="0" w:colLast="0" w:name="_xzfdmpbk5bhz" w:id="34"/>
+      <w:bookmarkEnd w:id="34"/>
+      <w:r>
+        <w:rPr>
+          <w:rtl w:val="0"/>
+        </w:rPr>
+        <w:t xml:space="preserve">Input</w:t>
+      </w:r>
+    </w:p>
+    <w:p>
+      <w:pPr>
+        <w:rPr/>
+      </w:pPr>
+      <w:r>
+        <w:rPr>
+          <w:rtl w:val="0"/>
+        </w:rPr>
+        <w:t xml:space="preserve">a = [2, 3, 4, 7]</w:t>
+      </w:r>
+    </w:p>
+    <w:p>
+      <w:pPr>
+        <w:rPr/>
+      </w:pPr>
+      <w:r>
+        <w:rPr>
+          <w:rtl w:val="0"/>
+        </w:rPr>
+        <w:t xml:space="preserve">b = a</w:t>
+      </w:r>
+    </w:p>
+    <w:p>
+      <w:pPr>
+        <w:rPr/>
+      </w:pPr>
+      <w:r>
+        <w:rPr>
+          <w:rtl w:val="0"/>
+        </w:rPr>
+        <w:t xml:space="preserve">b[2] = 8</w:t>
+      </w:r>
+    </w:p>
+    <w:p>
+      <w:pPr>
+        <w:rPr/>
+      </w:pPr>
+      <w:r>
+        <w:rPr>
+          <w:rtl w:val="0"/>
+        </w:rPr>
+        <w:t xml:space="preserve">print(f”Lista A: {a}”)</w:t>
+      </w:r>
+    </w:p>
+    <w:p>
+      <w:pPr>
+        <w:rPr/>
+      </w:pPr>
+      <w:r>
+        <w:rPr>
+          <w:rtl w:val="0"/>
+        </w:rPr>
+        <w:t xml:space="preserve">print(f”Lista B: {b}”)</w:t>
+      </w:r>
+    </w:p>
+    <w:p>
+      <w:pPr>
+        <w:pStyle w:val="Heading4"/>
+        <w:rPr/>
+      </w:pPr>
+      <w:bookmarkStart w:colFirst="0" w:colLast="0" w:name="_evds1n511g5p" w:id="35"/>
+      <w:bookmarkEnd w:id="35"/>
+      <w:r>
+        <w:rPr>
+          <w:rtl w:val="0"/>
+        </w:rPr>
+        <w:t xml:space="preserve">Output</w:t>
+      </w:r>
+    </w:p>
+    <w:p>
+      <w:pPr>
+        <w:rPr/>
+      </w:pPr>
+      <w:r>
+        <w:rPr>
+          <w:rtl w:val="0"/>
+        </w:rPr>
+        <w:t xml:space="preserve">Lista A: [2, 3, 8, 7]</w:t>
+      </w:r>
+    </w:p>
+    <w:p>
+      <w:pPr>
+        <w:rPr/>
+      </w:pPr>
+      <w:r>
+        <w:rPr>
+          <w:rtl w:val="0"/>
+        </w:rPr>
+        <w:t xml:space="preserve">Lista B: [2, 3, 8, 7]</w:t>
+      </w:r>
+    </w:p>
+    <w:p>
+      <w:pPr>
+        <w:pStyle w:val="Heading3"/>
+        <w:rPr/>
+      </w:pPr>
+      <w:bookmarkStart w:colFirst="0" w:colLast="0" w:name="_okz6514p11fg" w:id="36"/>
+      <w:bookmarkEnd w:id="36"/>
+      <w:r>
+        <w:rPr>
+          <w:rtl w:val="0"/>
+        </w:rPr>
+        <w:t xml:space="preserve">Criando uma cópia</w:t>
+      </w:r>
+    </w:p>
+    <w:p>
+      <w:pPr>
+        <w:pStyle w:val="Heading4"/>
+        <w:rPr/>
+      </w:pPr>
+      <w:bookmarkStart w:colFirst="0" w:colLast="0" w:name="_fekzarwbhw4" w:id="37"/>
+      <w:bookmarkEnd w:id="37"/>
+      <w:r>
+        <w:rPr>
+          <w:rtl w:val="0"/>
+        </w:rPr>
+        <w:t xml:space="preserve">Input</w:t>
+      </w:r>
+    </w:p>
+    <w:p>
+      <w:pPr>
+        <w:rPr/>
+      </w:pPr>
+      <w:r>
+        <w:rPr>
+          <w:rtl w:val="0"/>
+        </w:rPr>
+        <w:t xml:space="preserve">a = [2, 3, 4, 7]</w:t>
+      </w:r>
+    </w:p>
+    <w:p>
+      <w:pPr>
+        <w:rPr/>
+      </w:pPr>
+      <w:r>
+        <w:rPr>
+          <w:rtl w:val="0"/>
+        </w:rPr>
+        <w:t xml:space="preserve">b = a[:]</w:t>
+      </w:r>
+    </w:p>
+    <w:p>
+      <w:pPr>
+        <w:rPr/>
+      </w:pPr>
+      <w:r>
+        <w:rPr>
+          <w:rtl w:val="0"/>
+        </w:rPr>
+        <w:t xml:space="preserve">b[2] = 8</w:t>
+      </w:r>
+    </w:p>
+    <w:p>
+      <w:pPr>
+        <w:rPr/>
+      </w:pPr>
+      <w:r>
+        <w:rPr>
+          <w:rtl w:val="0"/>
+        </w:rPr>
+        <w:t xml:space="preserve">print(f”Lista A: {a}”)</w:t>
+      </w:r>
+    </w:p>
+    <w:p>
+      <w:pPr>
+        <w:rPr/>
+      </w:pPr>
+      <w:r>
+        <w:rPr>
+          <w:rtl w:val="0"/>
+        </w:rPr>
+        <w:t xml:space="preserve">print(f”Lista B: {b}”)</w:t>
+      </w:r>
+    </w:p>
+    <w:p>
+      <w:pPr>
+        <w:pStyle w:val="Heading4"/>
+        <w:rPr/>
+      </w:pPr>
+      <w:bookmarkStart w:colFirst="0" w:colLast="0" w:name="_nsu44kc0fa4j" w:id="38"/>
+      <w:bookmarkEnd w:id="38"/>
+      <w:r>
+        <w:rPr>
+          <w:rtl w:val="0"/>
+        </w:rPr>
+        <w:t xml:space="preserve">Output</w:t>
+      </w:r>
+    </w:p>
+    <w:p>
+      <w:pPr>
+        <w:rPr/>
+      </w:pPr>
+      <w:r>
+        <w:rPr>
+          <w:rtl w:val="0"/>
+        </w:rPr>
+        <w:t xml:space="preserve">Lista A: [2, 3, 4, 7]</w:t>
+      </w:r>
+    </w:p>
+    <w:p>
+      <w:pPr>
+        <w:rPr/>
+      </w:pPr>
+      <w:r>
+        <w:rPr>
+          <w:rtl w:val="0"/>
+        </w:rPr>
+        <w:t xml:space="preserve">Lista B: [2, 3, 8, 7]</w:t>
       </w:r>
     </w:p>
     <w:sectPr>

</xml_diff>

<commit_message>
Add: Anotações e desafios da aula 18.
</commit_message>
<xml_diff>
--- a/Mundo 3/Python Mundo 3 - Gustavo Guanabara.docx
+++ b/Mundo 3/Python Mundo 3 - Gustavo Guanabara.docx
@@ -209,7 +209,7 @@
           <wp:inline distB="114300" distT="114300" distL="114300" distR="114300">
             <wp:extent cx="4923410" cy="2567422"/>
             <wp:effectExtent b="0" l="0" r="0" t="0"/>
-            <wp:docPr id="2" name="image3.png"/>
+            <wp:docPr id="3" name="image3.png"/>
             <a:graphic>
               <a:graphicData uri="http://schemas.openxmlformats.org/drawingml/2006/picture">
                 <pic:pic>
@@ -218,7 +218,7 @@
                     <pic:cNvPicPr preferRelativeResize="0"/>
                   </pic:nvPicPr>
                   <pic:blipFill>
-                    <a:blip r:embed="rId6"/>
+                    <a:blip r:embed="rId7"/>
                     <a:srcRect b="0" l="0" r="0" t="0"/>
                     <a:stretch>
                       <a:fillRect/>
@@ -1242,16 +1242,16 @@
           <wp:inline distB="114300" distT="114300" distL="114300" distR="114300">
             <wp:extent cx="5731200" cy="571500"/>
             <wp:effectExtent b="0" l="0" r="0" t="0"/>
-            <wp:docPr id="5" name="image1.png"/>
+            <wp:docPr id="8" name="image7.png"/>
             <a:graphic>
               <a:graphicData uri="http://schemas.openxmlformats.org/drawingml/2006/picture">
                 <pic:pic>
                   <pic:nvPicPr>
-                    <pic:cNvPr id="0" name="image1.png"/>
+                    <pic:cNvPr id="0" name="image7.png"/>
                     <pic:cNvPicPr preferRelativeResize="0"/>
                   </pic:nvPicPr>
                   <pic:blipFill>
-                    <a:blip r:embed="rId7"/>
+                    <a:blip r:embed="rId8"/>
                     <a:srcRect b="0" l="0" r="0" t="0"/>
                     <a:stretch>
                       <a:fillRect/>
@@ -1575,16 +1575,16 @@
           <wp:inline distB="114300" distT="114300" distL="114300" distR="114300">
             <wp:extent cx="2887500" cy="882034"/>
             <wp:effectExtent b="0" l="0" r="0" t="0"/>
-            <wp:docPr id="3" name="image5.png"/>
+            <wp:docPr id="4" name="image4.png"/>
             <a:graphic>
               <a:graphicData uri="http://schemas.openxmlformats.org/drawingml/2006/picture">
                 <pic:pic>
                   <pic:nvPicPr>
-                    <pic:cNvPr id="0" name="image5.png"/>
+                    <pic:cNvPr id="0" name="image4.png"/>
                     <pic:cNvPicPr preferRelativeResize="0"/>
                   </pic:nvPicPr>
                   <pic:blipFill>
-                    <a:blip r:embed="rId8"/>
+                    <a:blip r:embed="rId9"/>
                     <a:srcRect b="0" l="0" r="0" t="0"/>
                     <a:stretch>
                       <a:fillRect/>
@@ -1677,16 +1677,16 @@
           <wp:inline distB="114300" distT="114300" distL="114300" distR="114300">
             <wp:extent cx="3620925" cy="1322504"/>
             <wp:effectExtent b="0" l="0" r="0" t="0"/>
-            <wp:docPr id="6" name="image2.png"/>
+            <wp:docPr id="9" name="image8.png"/>
             <a:graphic>
               <a:graphicData uri="http://schemas.openxmlformats.org/drawingml/2006/picture">
                 <pic:pic>
                   <pic:nvPicPr>
-                    <pic:cNvPr id="0" name="image2.png"/>
+                    <pic:cNvPr id="0" name="image8.png"/>
                     <pic:cNvPicPr preferRelativeResize="0"/>
                   </pic:nvPicPr>
                   <pic:blipFill>
-                    <a:blip r:embed="rId9"/>
+                    <a:blip r:embed="rId10"/>
                     <a:srcRect b="0" l="0" r="0" t="0"/>
                     <a:stretch>
                       <a:fillRect/>
@@ -1801,16 +1801,16 @@
           <wp:inline distB="114300" distT="114300" distL="114300" distR="114300">
             <wp:extent cx="3559013" cy="1518636"/>
             <wp:effectExtent b="0" l="0" r="0" t="0"/>
-            <wp:docPr id="1" name="image6.png"/>
+            <wp:docPr id="2" name="image2.png"/>
             <a:graphic>
               <a:graphicData uri="http://schemas.openxmlformats.org/drawingml/2006/picture">
                 <pic:pic>
                   <pic:nvPicPr>
-                    <pic:cNvPr id="0" name="image6.png"/>
+                    <pic:cNvPr id="0" name="image2.png"/>
                     <pic:cNvPicPr preferRelativeResize="0"/>
                   </pic:nvPicPr>
                   <pic:blipFill>
-                    <a:blip r:embed="rId10"/>
+                    <a:blip r:embed="rId11"/>
                     <a:srcRect b="0" l="0" r="0" t="0"/>
                     <a:stretch>
                       <a:fillRect/>
@@ -1868,16 +1868,16 @@
           <wp:inline distB="114300" distT="114300" distL="114300" distR="114300">
             <wp:extent cx="3282788" cy="1763326"/>
             <wp:effectExtent b="0" l="0" r="0" t="0"/>
-            <wp:docPr id="4" name="image4.png"/>
+            <wp:docPr id="5" name="image5.png"/>
             <a:graphic>
               <a:graphicData uri="http://schemas.openxmlformats.org/drawingml/2006/picture">
                 <pic:pic>
                   <pic:nvPicPr>
-                    <pic:cNvPr id="0" name="image4.png"/>
+                    <pic:cNvPr id="0" name="image5.png"/>
                     <pic:cNvPicPr preferRelativeResize="0"/>
                   </pic:nvPicPr>
                   <pic:blipFill>
-                    <a:blip r:embed="rId11"/>
+                    <a:blip r:embed="rId12"/>
                     <a:srcRect b="0" l="0" r="0" t="0"/>
                     <a:stretch>
                       <a:fillRect/>
@@ -2210,6 +2210,505 @@
         </w:rPr>
         <w:t xml:space="preserve">Lista B: [2, 3, 8, 7]</w:t>
       </w:r>
+      <w:r>
+        <w:br w:type="page"/>
+      </w:r>
+      <w:r>
+        <w:rPr>
+          <w:rtl w:val="0"/>
+        </w:rPr>
+      </w:r>
+    </w:p>
+    <w:p>
+      <w:pPr>
+        <w:pStyle w:val="Heading1"/>
+        <w:jc w:val="left"/>
+        <w:rPr/>
+      </w:pPr>
+      <w:bookmarkStart w:colFirst="0" w:colLast="0" w:name="_6gza2euo6g5z" w:id="39"/>
+      <w:bookmarkEnd w:id="39"/>
+      <w:r>
+        <w:rPr>
+          <w:rtl w:val="0"/>
+        </w:rPr>
+        <w:t xml:space="preserve">Aula 18  - Variáveis compostas - Listas (Parte 02):</w:t>
+      </w:r>
+    </w:p>
+    <w:p>
+      <w:pPr>
+        <w:rPr/>
+      </w:pPr>
+      <w:r>
+        <w:rPr>
+          <w:rtl w:val="0"/>
+        </w:rPr>
+        <w:t xml:space="preserve">É possível adicionar uma lista dentro de outra lista.</w:t>
+      </w:r>
+    </w:p>
+    <w:tbl>
+      <w:tblPr>
+        <w:tblStyle w:val="Table1"/>
+        <w:tblW w:w="9029.0" w:type="dxa"/>
+        <w:jc w:val="left"/>
+        <w:tblBorders>
+          <w:top w:color="000000" w:space="0" w:sz="8" w:val="single"/>
+          <w:left w:color="000000" w:space="0" w:sz="8" w:val="single"/>
+          <w:bottom w:color="000000" w:space="0" w:sz="8" w:val="single"/>
+          <w:right w:color="000000" w:space="0" w:sz="8" w:val="single"/>
+          <w:insideH w:color="000000" w:space="0" w:sz="8" w:val="single"/>
+          <w:insideV w:color="000000" w:space="0" w:sz="8" w:val="single"/>
+        </w:tblBorders>
+        <w:tblLayout w:type="fixed"/>
+        <w:tblLook w:val="0600"/>
+      </w:tblPr>
+      <w:tblGrid>
+        <w:gridCol w:w="9029"/>
+        <w:tblGridChange w:id="0">
+          <w:tblGrid>
+            <w:gridCol w:w="9029"/>
+          </w:tblGrid>
+        </w:tblGridChange>
+      </w:tblGrid>
+      <w:tr>
+        <w:trPr>
+          <w:cantSplit w:val="0"/>
+          <w:tblHeader w:val="0"/>
+        </w:trPr>
+        <w:tc>
+          <w:tcPr>
+            <w:shd w:fill="auto" w:val="clear"/>
+            <w:tcMar>
+              <w:top w:w="100.0" w:type="dxa"/>
+              <w:left w:w="100.0" w:type="dxa"/>
+              <w:bottom w:w="100.0" w:type="dxa"/>
+              <w:right w:w="100.0" w:type="dxa"/>
+            </w:tcMar>
+            <w:vAlign w:val="top"/>
+          </w:tcPr>
+          <w:p>
+            <w:pPr>
+              <w:jc w:val="left"/>
+              <w:rPr/>
+            </w:pPr>
+            <w:r>
+              <w:rPr>
+                <w:rtl w:val="0"/>
+              </w:rPr>
+              <w:t xml:space="preserve">pessoas = []</w:t>
+            </w:r>
+          </w:p>
+          <w:p>
+            <w:pPr>
+              <w:jc w:val="left"/>
+              <w:rPr/>
+            </w:pPr>
+            <w:r>
+              <w:rPr>
+                <w:rtl w:val="0"/>
+              </w:rPr>
+              <w:t xml:space="preserve">dados = [‘Pedro’, 25]</w:t>
+            </w:r>
+          </w:p>
+          <w:p>
+            <w:pPr>
+              <w:jc w:val="left"/>
+              <w:rPr/>
+            </w:pPr>
+            <w:r>
+              <w:rPr>
+                <w:rtl w:val="0"/>
+              </w:rPr>
+              <w:t xml:space="preserve">pessoas.append(dados</w:t>
+            </w:r>
+            <w:commentRangeStart w:id="0"/>
+            <w:r>
+              <w:rPr>
+                <w:rtl w:val="0"/>
+              </w:rPr>
+              <w:t xml:space="preserve">[:]</w:t>
+            </w:r>
+            <w:commentRangeEnd w:id="0"/>
+            <w:r>
+              <w:commentReference w:id="0"/>
+            </w:r>
+            <w:r>
+              <w:rPr>
+                <w:rtl w:val="0"/>
+              </w:rPr>
+              <w:t xml:space="preserve">)</w:t>
+            </w:r>
+          </w:p>
+        </w:tc>
+      </w:tr>
+    </w:tbl>
+    <w:p>
+      <w:pPr>
+        <w:rPr/>
+      </w:pPr>
+      <w:r>
+        <w:rPr>
+          <w:rtl w:val="0"/>
+        </w:rPr>
+        <w:t xml:space="preserve">O que acontece nesse caso é que foi criada uma cópia da lista de dados dentro da posição 0 da lista pessoas.</w:t>
+      </w:r>
+    </w:p>
+    <w:p>
+      <w:pPr>
+        <w:jc w:val="center"/>
+        <w:rPr/>
+      </w:pPr>
+      <w:r>
+        <w:rPr/>
+        <w:drawing>
+          <wp:inline distB="114300" distT="114300" distL="114300" distR="114300">
+            <wp:extent cx="5731200" cy="1943100"/>
+            <wp:effectExtent b="0" l="0" r="0" t="0"/>
+            <wp:docPr id="1" name="image1.png"/>
+            <a:graphic>
+              <a:graphicData uri="http://schemas.openxmlformats.org/drawingml/2006/picture">
+                <pic:pic>
+                  <pic:nvPicPr>
+                    <pic:cNvPr id="0" name="image1.png"/>
+                    <pic:cNvPicPr preferRelativeResize="0"/>
+                  </pic:nvPicPr>
+                  <pic:blipFill>
+                    <a:blip r:embed="rId13"/>
+                    <a:srcRect b="0" l="0" r="0" t="0"/>
+                    <a:stretch>
+                      <a:fillRect/>
+                    </a:stretch>
+                  </pic:blipFill>
+                  <pic:spPr>
+                    <a:xfrm>
+                      <a:off x="0" y="0"/>
+                      <a:ext cx="5731200" cy="1943100"/>
+                    </a:xfrm>
+                    <a:prstGeom prst="rect"/>
+                    <a:ln/>
+                  </pic:spPr>
+                </pic:pic>
+              </a:graphicData>
+            </a:graphic>
+          </wp:inline>
+        </w:drawing>
+      </w:r>
+      <w:r>
+        <w:rPr>
+          <w:rtl w:val="0"/>
+        </w:rPr>
+      </w:r>
+    </w:p>
+    <w:p>
+      <w:pPr>
+        <w:jc w:val="left"/>
+        <w:rPr/>
+      </w:pPr>
+      <w:r>
+        <w:rPr>
+          <w:rtl w:val="0"/>
+        </w:rPr>
+        <w:t xml:space="preserve">Podemos declarar tudo isso de uma vez só com essa estrutura:</w:t>
+      </w:r>
+    </w:p>
+    <w:p>
+      <w:pPr>
+        <w:jc w:val="center"/>
+        <w:rPr/>
+      </w:pPr>
+      <w:r>
+        <w:rPr/>
+        <w:drawing>
+          <wp:inline distB="114300" distT="114300" distL="114300" distR="114300">
+            <wp:extent cx="5731200" cy="317500"/>
+            <wp:effectExtent b="0" l="0" r="0" t="0"/>
+            <wp:docPr id="6" name="image9.png"/>
+            <a:graphic>
+              <a:graphicData uri="http://schemas.openxmlformats.org/drawingml/2006/picture">
+                <pic:pic>
+                  <pic:nvPicPr>
+                    <pic:cNvPr id="0" name="image9.png"/>
+                    <pic:cNvPicPr preferRelativeResize="0"/>
+                  </pic:nvPicPr>
+                  <pic:blipFill>
+                    <a:blip r:embed="rId14"/>
+                    <a:srcRect b="0" l="0" r="0" t="0"/>
+                    <a:stretch>
+                      <a:fillRect/>
+                    </a:stretch>
+                  </pic:blipFill>
+                  <pic:spPr>
+                    <a:xfrm>
+                      <a:off x="0" y="0"/>
+                      <a:ext cx="5731200" cy="317500"/>
+                    </a:xfrm>
+                    <a:prstGeom prst="rect"/>
+                    <a:ln/>
+                  </pic:spPr>
+                </pic:pic>
+              </a:graphicData>
+            </a:graphic>
+          </wp:inline>
+        </w:drawing>
+      </w:r>
+      <w:r>
+        <w:rPr>
+          <w:rtl w:val="0"/>
+        </w:rPr>
+      </w:r>
+    </w:p>
+    <w:p>
+      <w:pPr>
+        <w:jc w:val="left"/>
+        <w:rPr/>
+      </w:pPr>
+      <w:r>
+        <w:rPr>
+          <w:rtl w:val="0"/>
+        </w:rPr>
+        <w:t xml:space="preserve">Pode-se buscar dados específicos dessa forma:</w:t>
+      </w:r>
+    </w:p>
+    <w:p>
+      <w:pPr>
+        <w:jc w:val="center"/>
+        <w:rPr/>
+      </w:pPr>
+      <w:r>
+        <w:rPr/>
+        <w:drawing>
+          <wp:inline distB="114300" distT="114300" distL="114300" distR="114300">
+            <wp:extent cx="5731200" cy="1193800"/>
+            <wp:effectExtent b="0" l="0" r="0" t="0"/>
+            <wp:docPr id="7" name="image6.png"/>
+            <a:graphic>
+              <a:graphicData uri="http://schemas.openxmlformats.org/drawingml/2006/picture">
+                <pic:pic>
+                  <pic:nvPicPr>
+                    <pic:cNvPr id="0" name="image6.png"/>
+                    <pic:cNvPicPr preferRelativeResize="0"/>
+                  </pic:nvPicPr>
+                  <pic:blipFill>
+                    <a:blip r:embed="rId15"/>
+                    <a:srcRect b="0" l="0" r="0" t="0"/>
+                    <a:stretch>
+                      <a:fillRect/>
+                    </a:stretch>
+                  </pic:blipFill>
+                  <pic:spPr>
+                    <a:xfrm>
+                      <a:off x="0" y="0"/>
+                      <a:ext cx="5731200" cy="1193800"/>
+                    </a:xfrm>
+                    <a:prstGeom prst="rect"/>
+                    <a:ln/>
+                  </pic:spPr>
+                </pic:pic>
+              </a:graphicData>
+            </a:graphic>
+          </wp:inline>
+        </w:drawing>
+      </w:r>
+      <w:r>
+        <w:rPr>
+          <w:rtl w:val="0"/>
+        </w:rPr>
+      </w:r>
+    </w:p>
+    <w:p>
+      <w:pPr>
+        <w:jc w:val="left"/>
+        <w:rPr/>
+      </w:pPr>
+      <w:r>
+        <w:rPr>
+          <w:rtl w:val="0"/>
+        </w:rPr>
+        <w:t xml:space="preserve">O método clear limpa uma lista.</w:t>
+      </w:r>
+    </w:p>
+    <w:tbl>
+      <w:tblPr>
+        <w:tblStyle w:val="Table2"/>
+        <w:tblW w:w="9029.0" w:type="dxa"/>
+        <w:jc w:val="left"/>
+        <w:tblBorders>
+          <w:top w:color="000000" w:space="0" w:sz="8" w:val="single"/>
+          <w:left w:color="000000" w:space="0" w:sz="8" w:val="single"/>
+          <w:bottom w:color="000000" w:space="0" w:sz="8" w:val="single"/>
+          <w:right w:color="000000" w:space="0" w:sz="8" w:val="single"/>
+          <w:insideH w:color="000000" w:space="0" w:sz="8" w:val="single"/>
+          <w:insideV w:color="000000" w:space="0" w:sz="8" w:val="single"/>
+        </w:tblBorders>
+        <w:tblLayout w:type="fixed"/>
+        <w:tblLook w:val="0600"/>
+      </w:tblPr>
+      <w:tblGrid>
+        <w:gridCol w:w="9029"/>
+        <w:tblGridChange w:id="0">
+          <w:tblGrid>
+            <w:gridCol w:w="9029"/>
+          </w:tblGrid>
+        </w:tblGridChange>
+      </w:tblGrid>
+      <w:tr>
+        <w:trPr>
+          <w:cantSplit w:val="0"/>
+          <w:tblHeader w:val="0"/>
+        </w:trPr>
+        <w:tc>
+          <w:tcPr>
+            <w:shd w:fill="auto" w:val="clear"/>
+            <w:tcMar>
+              <w:top w:w="100.0" w:type="dxa"/>
+              <w:left w:w="100.0" w:type="dxa"/>
+              <w:bottom w:w="100.0" w:type="dxa"/>
+              <w:right w:w="100.0" w:type="dxa"/>
+            </w:tcMar>
+            <w:vAlign w:val="top"/>
+          </w:tcPr>
+          <w:p>
+            <w:pPr>
+              <w:keepNext w:val="0"/>
+              <w:keepLines w:val="0"/>
+              <w:pageBreakBefore w:val="0"/>
+              <w:widowControl w:val="0"/>
+              <w:pBdr>
+                <w:top w:space="0" w:sz="0" w:val="nil"/>
+                <w:left w:space="0" w:sz="0" w:val="nil"/>
+                <w:bottom w:space="0" w:sz="0" w:val="nil"/>
+                <w:right w:space="0" w:sz="0" w:val="nil"/>
+                <w:between w:space="0" w:sz="0" w:val="nil"/>
+              </w:pBdr>
+              <w:shd w:fill="auto" w:val="clear"/>
+              <w:spacing w:after="0" w:before="0" w:line="240" w:lineRule="auto"/>
+              <w:ind w:left="0" w:right="0" w:firstLine="0"/>
+              <w:jc w:val="left"/>
+              <w:rPr/>
+            </w:pPr>
+            <w:r>
+              <w:rPr>
+                <w:rtl w:val="0"/>
+              </w:rPr>
+              <w:t xml:space="preserve">dado.append(‘Maria’)</w:t>
+            </w:r>
+          </w:p>
+          <w:p>
+            <w:pPr>
+              <w:keepNext w:val="0"/>
+              <w:keepLines w:val="0"/>
+              <w:pageBreakBefore w:val="0"/>
+              <w:widowControl w:val="0"/>
+              <w:pBdr>
+                <w:top w:space="0" w:sz="0" w:val="nil"/>
+                <w:left w:space="0" w:sz="0" w:val="nil"/>
+                <w:bottom w:space="0" w:sz="0" w:val="nil"/>
+                <w:right w:space="0" w:sz="0" w:val="nil"/>
+                <w:between w:space="0" w:sz="0" w:val="nil"/>
+              </w:pBdr>
+              <w:shd w:fill="auto" w:val="clear"/>
+              <w:spacing w:after="0" w:before="0" w:line="240" w:lineRule="auto"/>
+              <w:ind w:left="0" w:right="0" w:firstLine="0"/>
+              <w:jc w:val="left"/>
+              <w:rPr/>
+            </w:pPr>
+            <w:r>
+              <w:rPr>
+                <w:rtl w:val="0"/>
+              </w:rPr>
+              <w:t xml:space="preserve">dado.append(22)</w:t>
+            </w:r>
+          </w:p>
+          <w:p>
+            <w:pPr>
+              <w:keepNext w:val="0"/>
+              <w:keepLines w:val="0"/>
+              <w:pageBreakBefore w:val="0"/>
+              <w:widowControl w:val="0"/>
+              <w:pBdr>
+                <w:top w:space="0" w:sz="0" w:val="nil"/>
+                <w:left w:space="0" w:sz="0" w:val="nil"/>
+                <w:bottom w:space="0" w:sz="0" w:val="nil"/>
+                <w:right w:space="0" w:sz="0" w:val="nil"/>
+                <w:between w:space="0" w:sz="0" w:val="nil"/>
+              </w:pBdr>
+              <w:shd w:fill="auto" w:val="clear"/>
+              <w:spacing w:after="0" w:before="0" w:line="240" w:lineRule="auto"/>
+              <w:ind w:left="0" w:right="0" w:firstLine="0"/>
+              <w:jc w:val="left"/>
+              <w:rPr/>
+            </w:pPr>
+            <w:r>
+              <w:rPr>
+                <w:rtl w:val="0"/>
+              </w:rPr>
+              <w:t xml:space="preserve"># dado == [‘Maria’, 22]</w:t>
+            </w:r>
+          </w:p>
+          <w:p>
+            <w:pPr>
+              <w:keepNext w:val="0"/>
+              <w:keepLines w:val="0"/>
+              <w:pageBreakBefore w:val="0"/>
+              <w:widowControl w:val="0"/>
+              <w:pBdr>
+                <w:top w:space="0" w:sz="0" w:val="nil"/>
+                <w:left w:space="0" w:sz="0" w:val="nil"/>
+                <w:bottom w:space="0" w:sz="0" w:val="nil"/>
+                <w:right w:space="0" w:sz="0" w:val="nil"/>
+                <w:between w:space="0" w:sz="0" w:val="nil"/>
+              </w:pBdr>
+              <w:shd w:fill="auto" w:val="clear"/>
+              <w:spacing w:after="0" w:before="0" w:line="240" w:lineRule="auto"/>
+              <w:ind w:left="0" w:right="0" w:firstLine="0"/>
+              <w:jc w:val="left"/>
+              <w:rPr/>
+            </w:pPr>
+            <w:r>
+              <w:rPr>
+                <w:rtl w:val="0"/>
+              </w:rPr>
+              <w:t xml:space="preserve">dado.clear()</w:t>
+            </w:r>
+          </w:p>
+          <w:p>
+            <w:pPr>
+              <w:keepNext w:val="0"/>
+              <w:keepLines w:val="0"/>
+              <w:pageBreakBefore w:val="0"/>
+              <w:widowControl w:val="0"/>
+              <w:pBdr>
+                <w:top w:space="0" w:sz="0" w:val="nil"/>
+                <w:left w:space="0" w:sz="0" w:val="nil"/>
+                <w:bottom w:space="0" w:sz="0" w:val="nil"/>
+                <w:right w:space="0" w:sz="0" w:val="nil"/>
+                <w:between w:space="0" w:sz="0" w:val="nil"/>
+              </w:pBdr>
+              <w:shd w:fill="auto" w:val="clear"/>
+              <w:spacing w:after="0" w:before="0" w:line="240" w:lineRule="auto"/>
+              <w:ind w:left="0" w:right="0" w:firstLine="0"/>
+              <w:jc w:val="left"/>
+              <w:rPr/>
+            </w:pPr>
+            <w:r>
+              <w:rPr>
+                <w:rtl w:val="0"/>
+              </w:rPr>
+              <w:t xml:space="preserve">#dado == []</w:t>
+            </w:r>
+          </w:p>
+        </w:tc>
+      </w:tr>
+    </w:tbl>
+    <w:p>
+      <w:pPr>
+        <w:jc w:val="left"/>
+        <w:rPr/>
+      </w:pPr>
+      <w:r>
+        <w:rPr>
+          <w:rtl w:val="0"/>
+        </w:rPr>
+      </w:r>
     </w:p>
     <w:sectPr>
       <w:pgSz w:h="16834" w:w="11909" w:orient="portrait"/>
@@ -2218,6 +2717,66 @@
     </w:sectPr>
   </w:body>
 </w:document>
+</file>
+
+<file path=word/comments.xml><?xml version="1.0" encoding="utf-8"?>
+<w:comments xmlns:mc="http://schemas.openxmlformats.org/markup-compatibility/2006" xmlns:o="urn:schemas-microsoft-com:office:office" xmlns:r="http://schemas.openxmlformats.org/officeDocument/2006/relationships" xmlns:m="http://schemas.openxmlformats.org/officeDocument/2006/math" xmlns:v="urn:schemas-microsoft-com:vml" xmlns:wp="http://schemas.openxmlformats.org/drawingml/2006/wordprocessingDrawing" xmlns:w10="urn:schemas-microsoft-com:office:word" xmlns:w="http://schemas.openxmlformats.org/wordprocessingml/2006/main" xmlns:wne="http://schemas.microsoft.com/office/word/2006/wordml" xmlns:sl="http://schemas.openxmlformats.org/schemaLibrary/2006/main" xmlns:a="http://schemas.openxmlformats.org/drawingml/2006/main" xmlns:pic="http://schemas.openxmlformats.org/drawingml/2006/picture" xmlns:c="http://schemas.openxmlformats.org/drawingml/2006/chart" xmlns:lc="http://schemas.openxmlformats.org/drawingml/2006/lockedCanvas" xmlns:dgm="http://schemas.openxmlformats.org/drawingml/2006/diagram" xmlns:wps="http://schemas.microsoft.com/office/word/2010/wordprocessingShape" xmlns:wpg="http://schemas.microsoft.com/office/word/2010/wordprocessingGroup" xmlns:w14="http://schemas.microsoft.com/office/word/2010/wordml" xmlns:w15="http://schemas.microsoft.com/office/word/2012/wordml" xmlns:w16="http://schemas.microsoft.com/office/word/2018/wordml" xmlns:w16cex="http://schemas.microsoft.com/office/word/2018/wordml/cex" xmlns:w16cid="http://schemas.microsoft.com/office/word/2016/wordml/cid" xmlns="http://schemas.microsoft.com/office/tasks/2019/documenttasks" xmlns:cr="http://schemas.microsoft.com/office/comments/2020/reactions">
+  <w:comment w:author="Gustavo Valentim “Gustavo” Simão" w:id="0" w:date="2026-10-19T19:14:31Z">
+    <w:p>
+      <w:pPr>
+        <w:keepNext w:val="0"/>
+        <w:keepLines w:val="0"/>
+        <w:pageBreakBefore w:val="0"/>
+        <w:widowControl w:val="0"/>
+        <w:pBdr>
+          <w:top w:space="0" w:sz="0" w:val="nil"/>
+          <w:left w:space="0" w:sz="0" w:val="nil"/>
+          <w:bottom w:space="0" w:sz="0" w:val="nil"/>
+          <w:right w:space="0" w:sz="0" w:val="nil"/>
+          <w:between w:space="0" w:sz="0" w:val="nil"/>
+        </w:pBdr>
+        <w:shd w:fill="auto" w:val="clear"/>
+        <w:spacing w:after="0" w:before="0" w:line="240" w:lineRule="auto"/>
+        <w:ind w:left="0" w:right="0" w:firstLine="0"/>
+        <w:jc w:val="left"/>
+        <w:rPr>
+          <w:rFonts w:ascii="Arial" w:cs="Arial" w:eastAsia="Arial" w:hAnsi="Arial"/>
+          <w:b w:val="0"/>
+          <w:bCs w:val="0"/>
+          <w:i w:val="0"/>
+          <w:iCs w:val="0"/>
+          <w:smallCaps w:val="0"/>
+          <w:strike w:val="0"/>
+          <w:color w:val="000000"/>
+          <w:sz w:val="22"/>
+          <w:szCs w:val="22"/>
+          <w:u w:val="none"/>
+          <w:shd w:fill="auto" w:val="clear"/>
+          <w:vertAlign w:val="baseline"/>
+        </w:rPr>
+      </w:pPr>
+      <w:r>
+        <w:rPr>
+          <w:rFonts w:ascii="Arial" w:cs="Arial" w:eastAsia="Arial" w:hAnsi="Arial"/>
+          <w:b w:val="0"/>
+          <w:bCs w:val="0"/>
+          <w:i w:val="0"/>
+          <w:iCs w:val="0"/>
+          <w:smallCaps w:val="0"/>
+          <w:strike w:val="0"/>
+          <w:color w:val="000000"/>
+          <w:sz w:val="22"/>
+          <w:szCs w:val="22"/>
+          <w:u w:val="none"/>
+          <w:shd w:fill="auto" w:val="clear"/>
+          <w:vertAlign w:val="baseline"/>
+          <w:rtl w:val="0"/>
+        </w:rPr>
+        <w:t xml:space="preserve">Cria uma cópia dos dados da lista, ao invés de criar um link.</w:t>
+      </w:r>
+    </w:p>
+  </w:comment>
+</w:comments>
 </file>
 
 <file path=word/numbering.xml><?xml version="1.0" encoding="utf-8"?>
@@ -2612,6 +3171,20 @@
       <w:sz w:val="30"/>
       <w:szCs w:val="30"/>
     </w:rPr>
+  </w:style>
+  <w:style w:type="table" w:styleId="Table1">
+    <w:basedOn w:val="TableNormal"/>
+    <w:tblPr>
+      <w:tblStyleRowBandSize w:val="1"/>
+      <w:tblStyleColBandSize w:val="1"/>
+    </w:tblPr>
+  </w:style>
+  <w:style w:type="table" w:styleId="Table2">
+    <w:basedOn w:val="TableNormal"/>
+    <w:tblPr>
+      <w:tblStyleRowBandSize w:val="1"/>
+      <w:tblStyleColBandSize w:val="1"/>
+    </w:tblPr>
   </w:style>
 </w:styles>
 </file>

</xml_diff>